<commit_message>
Add lesson 11 (README) and the ruleset setup to lesson 10
Co-Authored-By: Claude Opus 5.5 <noreply@anthropic.com>
</commit_message>
<xml_diff>
--- a/Documents/Lesson 10 - Continuous Integration with GitHub Actions.docx
+++ b/Documents/Lesson 10 - Continuous Integration with GitHub Actions.docx
@@ -43,17 +43,17 @@
         <w:t xml:space="preserve">Status:</w:t>
       </w:r>
       <w:r>
-        <w:t xml:space="preserve"> Workflow written and checked locally (branch </w:t>
+        <w:t xml:space="preserve"> Done. CI runs on every push and pull request, and </w:t>
       </w:r>
       <w:r>
         <w:rPr>
           <w:rFonts w:ascii="Consolas" w:cs="Consolas" w:eastAsia="Consolas" w:hAnsi="Consolas"/>
           <w:color w:val="C7254E"/>
         </w:rPr>
-        <w:t xml:space="preserve">feature/ci</w:t>
-      </w:r>
-      <w:r>
-        <w:t xml:space="preserve">). The first real run happens on GitHub after the push.</w:t>
+        <w:t xml:space="preserve">master</w:t>
+      </w:r>
+      <w:r>
+        <w:t xml:space="preserve"> is protected by a ruleset.</w:t>
       </w:r>
     </w:p>
     <w:p>
@@ -2336,7 +2336,7 @@
         <w:pStyle w:val="Heading2"/>
       </w:pPr>
       <w:r>
-        <w:t xml:space="preserve">7. Making CI required (do this on GitHub)</w:t>
+        <w:t xml:space="preserve">7. Making CI required: the ruleset</w:t>
       </w:r>
     </w:p>
     <w:p>
@@ -2351,7 +2351,27 @@
         <w:t xml:space="preserve">blocks</w:t>
       </w:r>
       <w:r>
-        <w:t xml:space="preserve"> the merge:</w:t>
+        <w:t xml:space="preserve"> the merge. A </w:t>
+      </w:r>
+      <w:r>
+        <w:rPr>
+          <w:b/>
+          <w:bCs/>
+        </w:rPr>
+        <w:t xml:space="preserve">ruleset</w:t>
+      </w:r>
+      <w:r>
+        <w:t xml:space="preserve"> was created for </w:t>
+      </w:r>
+      <w:r>
+        <w:rPr>
+          <w:rFonts w:ascii="Consolas" w:cs="Consolas" w:eastAsia="Consolas" w:hAnsi="Consolas"/>
+          <w:color w:val="C7254E"/>
+        </w:rPr>
+        <w:t xml:space="preserve">master</w:t>
+      </w:r>
+      <w:r>
+        <w:t xml:space="preserve">:</w:t>
       </w:r>
     </w:p>
     <w:p>
@@ -2380,17 +2400,17 @@
           <w:b/>
           <w:bCs/>
         </w:rPr>
-        <w:t xml:space="preserve">Branches</w:t>
-      </w:r>
-      <w:r>
-        <w:t xml:space="preserve"> (or </w:t>
+        <w:t xml:space="preserve">Rules</w:t>
+      </w:r>
+      <w:r>
+        <w:t xml:space="preserve">, then </w:t>
       </w:r>
       <w:r>
         <w:rPr>
           <w:b/>
           <w:bCs/>
         </w:rPr>
-        <w:t xml:space="preserve">Rules</w:t>
+        <w:t xml:space="preserve">Rulesets</w:t>
       </w:r>
       <w:r>
         <w:t xml:space="preserve">, then </w:t>
@@ -2400,10 +2420,10 @@
           <w:b/>
           <w:bCs/>
         </w:rPr>
-        <w:t xml:space="preserve">Rulesets</w:t>
-      </w:r>
-      <w:r>
-        <w:t xml:space="preserve">).</w:t>
+        <w:t xml:space="preserve">New branch ruleset</w:t>
+      </w:r>
+      <w:r>
+        <w:t xml:space="preserve">.</w:t>
       </w:r>
     </w:p>
     <w:p>
@@ -2415,17 +2435,47 @@
         </w:numPr>
       </w:pPr>
       <w:r>
-        <w:t xml:space="preserve">Add a rule for the </w:t>
+        <w:t xml:space="preserve">Name it </w:t>
       </w:r>
       <w:r>
         <w:rPr>
           <w:rFonts w:ascii="Consolas" w:cs="Consolas" w:eastAsia="Consolas" w:hAnsi="Consolas"/>
           <w:color w:val="C7254E"/>
         </w:rPr>
-        <w:t xml:space="preserve">master</w:t>
-      </w:r>
-      <w:r>
-        <w:t xml:space="preserve"> branch.</w:t>
+        <w:t xml:space="preserve">Protect master</w:t>
+      </w:r>
+      <w:r>
+        <w:t xml:space="preserve">, set </w:t>
+      </w:r>
+      <w:r>
+        <w:rPr>
+          <w:b/>
+          <w:bCs/>
+        </w:rPr>
+        <w:t xml:space="preserve">Enforcement status</w:t>
+      </w:r>
+      <w:r>
+        <w:t xml:space="preserve"> to </w:t>
+      </w:r>
+      <w:r>
+        <w:rPr>
+          <w:b/>
+          <w:bCs/>
+        </w:rPr>
+        <w:t xml:space="preserve">Active</w:t>
+      </w:r>
+      <w:r>
+        <w:t xml:space="preserve">, and leave the </w:t>
+      </w:r>
+      <w:r>
+        <w:rPr>
+          <w:b/>
+          <w:bCs/>
+        </w:rPr>
+        <w:t xml:space="preserve">Bypass list</w:t>
+      </w:r>
+      <w:r>
+        <w:t xml:space="preserve"> empty, so the rules apply to the owner too.</w:t>
       </w:r>
     </w:p>
     <w:p>
@@ -2437,81 +2487,482 @@
         </w:numPr>
       </w:pPr>
       <w:r>
-        <w:t xml:space="preserve">Enable </w:t>
-      </w:r>
-      <w:r>
         <w:rPr>
           <w:b/>
           <w:bCs/>
         </w:rPr>
-        <w:t xml:space="preserve">Require a pull request before merging</w:t>
-      </w:r>
-      <w:r>
-        <w:t xml:space="preserve">, and </w:t>
+        <w:t xml:space="preserve">Target branches</w:t>
+      </w:r>
+      <w:r>
+        <w:t xml:space="preserve">: Include default branch (</w:t>
+      </w:r>
+      <w:r>
+        <w:rPr>
+          <w:rFonts w:ascii="Consolas" w:cs="Consolas" w:eastAsia="Consolas" w:hAnsi="Consolas"/>
+          <w:color w:val="C7254E"/>
+        </w:rPr>
+        <w:t xml:space="preserve">master</w:t>
+      </w:r>
+      <w:r>
+        <w:t xml:space="preserve">).</w:t>
+      </w:r>
+    </w:p>
+    <w:p>
+      <w:pPr>
+        <w:pStyle w:val="ListParagraph"/>
+        <w:numPr>
+          <w:ilvl w:val="0"/>
+          <w:numId w:val="3"/>
+        </w:numPr>
+      </w:pPr>
+      <w:r>
+        <w:t xml:space="preserve">Rules:</w:t>
+      </w:r>
+    </w:p>
+    <w:tbl>
+      <w:tblPr>
+        <w:tblW w:type="dxa" w:w="9026"/>
+        <w:tblBorders>
+          <w:top w:val="single" w:color="auto" w:sz="4"/>
+          <w:left w:val="single" w:color="auto" w:sz="4"/>
+          <w:bottom w:val="single" w:color="auto" w:sz="4"/>
+          <w:right w:val="single" w:color="auto" w:sz="4"/>
+          <w:insideH w:val="single" w:color="auto" w:sz="4"/>
+          <w:insideV w:val="single" w:color="auto" w:sz="4"/>
+        </w:tblBorders>
+      </w:tblPr>
+      <w:tblGrid>
+        <w:gridCol w:w="3008"/>
+        <w:gridCol w:w="3008"/>
+        <w:gridCol w:w="3010"/>
+      </w:tblGrid>
+      <w:tr>
+        <w:trPr>
+          <w:tblHeader/>
+        </w:trPr>
+        <w:tc>
+          <w:tcPr>
+            <w:tcW w:type="dxa" w:w="3008"/>
+            <w:tcBorders>
+              <w:top w:val="single" w:color="BFBFBF" w:sz="4"/>
+              <w:left w:val="single" w:color="BFBFBF" w:sz="4"/>
+              <w:bottom w:val="single" w:color="BFBFBF" w:sz="4"/>
+              <w:right w:val="single" w:color="BFBFBF" w:sz="4"/>
+            </w:tcBorders>
+            <w:shd w:fill="1F4E79" w:color="auto" w:val="clear"/>
+            <w:tcMar>
+              <w:top w:type="dxa" w:w="80"/>
+              <w:left w:type="dxa" w:w="120"/>
+              <w:bottom w:type="dxa" w:w="80"/>
+              <w:right w:type="dxa" w:w="120"/>
+            </w:tcMar>
+          </w:tcPr>
+          <w:p>
+            <w:r>
+              <w:rPr>
+                <w:b/>
+                <w:bCs/>
+                <w:color w:val="FFFFFF"/>
+              </w:rPr>
+              <w:t xml:space="preserve">Rule</w:t>
+            </w:r>
+          </w:p>
+        </w:tc>
+        <w:tc>
+          <w:tcPr>
+            <w:tcW w:type="dxa" w:w="3008"/>
+            <w:tcBorders>
+              <w:top w:val="single" w:color="BFBFBF" w:sz="4"/>
+              <w:left w:val="single" w:color="BFBFBF" w:sz="4"/>
+              <w:bottom w:val="single" w:color="BFBFBF" w:sz="4"/>
+              <w:right w:val="single" w:color="BFBFBF" w:sz="4"/>
+            </w:tcBorders>
+            <w:shd w:fill="1F4E79" w:color="auto" w:val="clear"/>
+            <w:tcMar>
+              <w:top w:type="dxa" w:w="80"/>
+              <w:left w:type="dxa" w:w="120"/>
+              <w:bottom w:type="dxa" w:w="80"/>
+              <w:right w:type="dxa" w:w="120"/>
+            </w:tcMar>
+          </w:tcPr>
+          <w:p>
+            <w:r>
+              <w:rPr>
+                <w:b/>
+                <w:bCs/>
+                <w:color w:val="FFFFFF"/>
+              </w:rPr>
+              <w:t xml:space="preserve">Setting</w:t>
+            </w:r>
+          </w:p>
+        </w:tc>
+        <w:tc>
+          <w:tcPr>
+            <w:tcW w:type="dxa" w:w="3010"/>
+            <w:tcBorders>
+              <w:top w:val="single" w:color="BFBFBF" w:sz="4"/>
+              <w:left w:val="single" w:color="BFBFBF" w:sz="4"/>
+              <w:bottom w:val="single" w:color="BFBFBF" w:sz="4"/>
+              <w:right w:val="single" w:color="BFBFBF" w:sz="4"/>
+            </w:tcBorders>
+            <w:shd w:fill="1F4E79" w:color="auto" w:val="clear"/>
+            <w:tcMar>
+              <w:top w:type="dxa" w:w="80"/>
+              <w:left w:type="dxa" w:w="120"/>
+              <w:bottom w:type="dxa" w:w="80"/>
+              <w:right w:type="dxa" w:w="120"/>
+            </w:tcMar>
+          </w:tcPr>
+          <w:p>
+            <w:r>
+              <w:rPr>
+                <w:b/>
+                <w:bCs/>
+                <w:color w:val="FFFFFF"/>
+              </w:rPr>
+              <w:t xml:space="preserve">Why</w:t>
+            </w:r>
+          </w:p>
+        </w:tc>
+      </w:tr>
+      <w:tr>
+        <w:trPr>
+          <w:tblHeader w:val="off"/>
+        </w:trPr>
+        <w:tc>
+          <w:tcPr>
+            <w:tcW w:type="dxa" w:w="3008"/>
+            <w:tcBorders>
+              <w:top w:val="single" w:color="BFBFBF" w:sz="4"/>
+              <w:left w:val="single" w:color="BFBFBF" w:sz="4"/>
+              <w:bottom w:val="single" w:color="BFBFBF" w:sz="4"/>
+              <w:right w:val="single" w:color="BFBFBF" w:sz="4"/>
+            </w:tcBorders>
+            <w:tcMar>
+              <w:top w:type="dxa" w:w="80"/>
+              <w:left w:type="dxa" w:w="120"/>
+              <w:bottom w:type="dxa" w:w="80"/>
+              <w:right w:type="dxa" w:w="120"/>
+            </w:tcMar>
+          </w:tcPr>
+          <w:p>
+            <w:r>
+              <w:t xml:space="preserve">Restrict deletions</w:t>
+            </w:r>
+          </w:p>
+        </w:tc>
+        <w:tc>
+          <w:tcPr>
+            <w:tcW w:type="dxa" w:w="3008"/>
+            <w:tcBorders>
+              <w:top w:val="single" w:color="BFBFBF" w:sz="4"/>
+              <w:left w:val="single" w:color="BFBFBF" w:sz="4"/>
+              <w:bottom w:val="single" w:color="BFBFBF" w:sz="4"/>
+              <w:right w:val="single" w:color="BFBFBF" w:sz="4"/>
+            </w:tcBorders>
+            <w:tcMar>
+              <w:top w:type="dxa" w:w="80"/>
+              <w:left w:type="dxa" w:w="120"/>
+              <w:bottom w:type="dxa" w:w="80"/>
+              <w:right w:type="dxa" w:w="120"/>
+            </w:tcMar>
+          </w:tcPr>
+          <w:p>
+            <w:r>
+              <w:t xml:space="preserve">on</w:t>
+            </w:r>
+          </w:p>
+        </w:tc>
+        <w:tc>
+          <w:tcPr>
+            <w:tcW w:type="dxa" w:w="3010"/>
+            <w:tcBorders>
+              <w:top w:val="single" w:color="BFBFBF" w:sz="4"/>
+              <w:left w:val="single" w:color="BFBFBF" w:sz="4"/>
+              <w:bottom w:val="single" w:color="BFBFBF" w:sz="4"/>
+              <w:right w:val="single" w:color="BFBFBF" w:sz="4"/>
+            </w:tcBorders>
+            <w:tcMar>
+              <w:top w:type="dxa" w:w="80"/>
+              <w:left w:type="dxa" w:w="120"/>
+              <w:bottom w:type="dxa" w:w="80"/>
+              <w:right w:type="dxa" w:w="120"/>
+            </w:tcMar>
+          </w:tcPr>
+          <w:p>
+            <w:r>
+              <w:t xml:space="preserve">Nobody can delete </w:t>
+            </w:r>
+            <w:r>
+              <w:rPr>
+                <w:rFonts w:ascii="Consolas" w:cs="Consolas" w:eastAsia="Consolas" w:hAnsi="Consolas"/>
+                <w:color w:val="C7254E"/>
+              </w:rPr>
+              <w:t xml:space="preserve">master</w:t>
+            </w:r>
+          </w:p>
+        </w:tc>
+      </w:tr>
+      <w:tr>
+        <w:trPr>
+          <w:tblHeader w:val="off"/>
+        </w:trPr>
+        <w:tc>
+          <w:tcPr>
+            <w:tcW w:type="dxa" w:w="3008"/>
+            <w:tcBorders>
+              <w:top w:val="single" w:color="BFBFBF" w:sz="4"/>
+              <w:left w:val="single" w:color="BFBFBF" w:sz="4"/>
+              <w:bottom w:val="single" w:color="BFBFBF" w:sz="4"/>
+              <w:right w:val="single" w:color="BFBFBF" w:sz="4"/>
+            </w:tcBorders>
+            <w:tcMar>
+              <w:top w:type="dxa" w:w="80"/>
+              <w:left w:type="dxa" w:w="120"/>
+              <w:bottom w:type="dxa" w:w="80"/>
+              <w:right w:type="dxa" w:w="120"/>
+            </w:tcMar>
+          </w:tcPr>
+          <w:p>
+            <w:r>
+              <w:t xml:space="preserve">Block force pushes</w:t>
+            </w:r>
+          </w:p>
+        </w:tc>
+        <w:tc>
+          <w:tcPr>
+            <w:tcW w:type="dxa" w:w="3008"/>
+            <w:tcBorders>
+              <w:top w:val="single" w:color="BFBFBF" w:sz="4"/>
+              <w:left w:val="single" w:color="BFBFBF" w:sz="4"/>
+              <w:bottom w:val="single" w:color="BFBFBF" w:sz="4"/>
+              <w:right w:val="single" w:color="BFBFBF" w:sz="4"/>
+            </w:tcBorders>
+            <w:tcMar>
+              <w:top w:type="dxa" w:w="80"/>
+              <w:left w:type="dxa" w:w="120"/>
+              <w:bottom w:type="dxa" w:w="80"/>
+              <w:right w:type="dxa" w:w="120"/>
+            </w:tcMar>
+          </w:tcPr>
+          <w:p>
+            <w:r>
+              <w:t xml:space="preserve">on</w:t>
+            </w:r>
+          </w:p>
+        </w:tc>
+        <w:tc>
+          <w:tcPr>
+            <w:tcW w:type="dxa" w:w="3010"/>
+            <w:tcBorders>
+              <w:top w:val="single" w:color="BFBFBF" w:sz="4"/>
+              <w:left w:val="single" w:color="BFBFBF" w:sz="4"/>
+              <w:bottom w:val="single" w:color="BFBFBF" w:sz="4"/>
+              <w:right w:val="single" w:color="BFBFBF" w:sz="4"/>
+            </w:tcBorders>
+            <w:tcMar>
+              <w:top w:type="dxa" w:w="80"/>
+              <w:left w:type="dxa" w:w="120"/>
+              <w:bottom w:type="dxa" w:w="80"/>
+              <w:right w:type="dxa" w:w="120"/>
+            </w:tcMar>
+          </w:tcPr>
+          <w:p>
+            <w:r>
+              <w:t xml:space="preserve">History on </w:t>
+            </w:r>
+            <w:r>
+              <w:rPr>
+                <w:rFonts w:ascii="Consolas" w:cs="Consolas" w:eastAsia="Consolas" w:hAnsi="Consolas"/>
+                <w:color w:val="C7254E"/>
+              </w:rPr>
+              <w:t xml:space="preserve">master</w:t>
+            </w:r>
+            <w:r>
+              <w:t xml:space="preserve"> cannot be rewritten</w:t>
+            </w:r>
+          </w:p>
+        </w:tc>
+      </w:tr>
+      <w:tr>
+        <w:trPr>
+          <w:tblHeader w:val="off"/>
+        </w:trPr>
+        <w:tc>
+          <w:tcPr>
+            <w:tcW w:type="dxa" w:w="3008"/>
+            <w:tcBorders>
+              <w:top w:val="single" w:color="BFBFBF" w:sz="4"/>
+              <w:left w:val="single" w:color="BFBFBF" w:sz="4"/>
+              <w:bottom w:val="single" w:color="BFBFBF" w:sz="4"/>
+              <w:right w:val="single" w:color="BFBFBF" w:sz="4"/>
+            </w:tcBorders>
+            <w:tcMar>
+              <w:top w:type="dxa" w:w="80"/>
+              <w:left w:type="dxa" w:w="120"/>
+              <w:bottom w:type="dxa" w:w="80"/>
+              <w:right w:type="dxa" w:w="120"/>
+            </w:tcMar>
+          </w:tcPr>
+          <w:p>
+            <w:r>
+              <w:t xml:space="preserve">Require a pull request before merging</w:t>
+            </w:r>
+          </w:p>
+        </w:tc>
+        <w:tc>
+          <w:tcPr>
+            <w:tcW w:type="dxa" w:w="3008"/>
+            <w:tcBorders>
+              <w:top w:val="single" w:color="BFBFBF" w:sz="4"/>
+              <w:left w:val="single" w:color="BFBFBF" w:sz="4"/>
+              <w:bottom w:val="single" w:color="BFBFBF" w:sz="4"/>
+              <w:right w:val="single" w:color="BFBFBF" w:sz="4"/>
+            </w:tcBorders>
+            <w:tcMar>
+              <w:top w:type="dxa" w:w="80"/>
+              <w:left w:type="dxa" w:w="120"/>
+              <w:bottom w:type="dxa" w:w="80"/>
+              <w:right w:type="dxa" w:w="120"/>
+            </w:tcMar>
+          </w:tcPr>
+          <w:p>
+            <w:r>
+              <w:t xml:space="preserve">on, </w:t>
+            </w:r>
+            <w:r>
+              <w:rPr>
+                <w:b/>
+                <w:bCs/>
+              </w:rPr>
+              <w:t xml:space="preserve">Required approvals = 0</w:t>
+            </w:r>
+          </w:p>
+        </w:tc>
+        <w:tc>
+          <w:tcPr>
+            <w:tcW w:type="dxa" w:w="3010"/>
+            <w:tcBorders>
+              <w:top w:val="single" w:color="BFBFBF" w:sz="4"/>
+              <w:left w:val="single" w:color="BFBFBF" w:sz="4"/>
+              <w:bottom w:val="single" w:color="BFBFBF" w:sz="4"/>
+              <w:right w:val="single" w:color="BFBFBF" w:sz="4"/>
+            </w:tcBorders>
+            <w:tcMar>
+              <w:top w:type="dxa" w:w="80"/>
+              <w:left w:type="dxa" w:w="120"/>
+              <w:bottom w:type="dxa" w:w="80"/>
+              <w:right w:type="dxa" w:w="120"/>
+            </w:tcMar>
+          </w:tcPr>
+          <w:p>
+            <w:r>
+              <w:t xml:space="preserve">Every change goes through a PR. GitHub never lets you approve your own PR, so a solo developer needs 0</w:t>
+            </w:r>
+          </w:p>
+        </w:tc>
+      </w:tr>
+      <w:tr>
+        <w:trPr>
+          <w:tblHeader w:val="off"/>
+        </w:trPr>
+        <w:tc>
+          <w:tcPr>
+            <w:tcW w:type="dxa" w:w="3008"/>
+            <w:tcBorders>
+              <w:top w:val="single" w:color="BFBFBF" w:sz="4"/>
+              <w:left w:val="single" w:color="BFBFBF" w:sz="4"/>
+              <w:bottom w:val="single" w:color="BFBFBF" w:sz="4"/>
+              <w:right w:val="single" w:color="BFBFBF" w:sz="4"/>
+            </w:tcBorders>
+            <w:tcMar>
+              <w:top w:type="dxa" w:w="80"/>
+              <w:left w:type="dxa" w:w="120"/>
+              <w:bottom w:type="dxa" w:w="80"/>
+              <w:right w:type="dxa" w:w="120"/>
+            </w:tcMar>
+          </w:tcPr>
+          <w:p>
+            <w:r>
+              <w:t xml:space="preserve">Require status checks to pass</w:t>
+            </w:r>
+          </w:p>
+        </w:tc>
+        <w:tc>
+          <w:tcPr>
+            <w:tcW w:type="dxa" w:w="3008"/>
+            <w:tcBorders>
+              <w:top w:val="single" w:color="BFBFBF" w:sz="4"/>
+              <w:left w:val="single" w:color="BFBFBF" w:sz="4"/>
+              <w:bottom w:val="single" w:color="BFBFBF" w:sz="4"/>
+              <w:right w:val="single" w:color="BFBFBF" w:sz="4"/>
+            </w:tcBorders>
+            <w:tcMar>
+              <w:top w:type="dxa" w:w="80"/>
+              <w:left w:type="dxa" w:w="120"/>
+              <w:bottom w:type="dxa" w:w="80"/>
+              <w:right w:type="dxa" w:w="120"/>
+            </w:tcMar>
+          </w:tcPr>
+          <w:p>
+            <w:r>
+              <w:rPr>
+                <w:rFonts w:ascii="Consolas" w:cs="Consolas" w:eastAsia="Consolas" w:hAnsi="Consolas"/>
+                <w:color w:val="C7254E"/>
+              </w:rPr>
+              <w:t xml:space="preserve">build-and-test</w:t>
+            </w:r>
+            <w:r>
+              <w:t xml:space="preserve">, and "Require branches to be up to date"</w:t>
+            </w:r>
+          </w:p>
+        </w:tc>
+        <w:tc>
+          <w:tcPr>
+            <w:tcW w:type="dxa" w:w="3010"/>
+            <w:tcBorders>
+              <w:top w:val="single" w:color="BFBFBF" w:sz="4"/>
+              <w:left w:val="single" w:color="BFBFBF" w:sz="4"/>
+              <w:bottom w:val="single" w:color="BFBFBF" w:sz="4"/>
+              <w:right w:val="single" w:color="BFBFBF" w:sz="4"/>
+            </w:tcBorders>
+            <w:tcMar>
+              <w:top w:type="dxa" w:w="80"/>
+              <w:left w:type="dxa" w:w="120"/>
+              <w:bottom w:type="dxa" w:w="80"/>
+              <w:right w:type="dxa" w:w="120"/>
+            </w:tcMar>
+          </w:tcPr>
+          <w:p>
+            <w:r>
+              <w:t xml:space="preserve">The Merge button stays disabled until CI is green on the combined code</w:t>
+            </w:r>
+          </w:p>
+        </w:tc>
+      </w:tr>
+    </w:tbl>
+    <w:p/>
+    <w:p>
+      <w:r>
+        <w:t xml:space="preserve">The </w:t>
       </w:r>
       <w:r>
         <w:rPr>
           <w:b/>
           <w:bCs/>
         </w:rPr>
-        <w:t xml:space="preserve">Require status checks to pass</w:t>
-      </w:r>
-      <w:r>
-        <w:t xml:space="preserve">. Then select the check </w:t>
-      </w:r>
-      <w:r>
-        <w:rPr>
-          <w:b/>
-          <w:bCs/>
-        </w:rPr>
         <w:t xml:space="preserve">build-and-test</w:t>
       </w:r>
       <w:r>
-        <w:t xml:space="preserve">.</w:t>
-      </w:r>
-    </w:p>
-    <w:p>
-      <w:r>
-        <w:t xml:space="preserve">The check only appears in that list after the workflow has run once.</w:t>
-      </w:r>
-    </w:p>
-    <w:p>
-      <w:r>
-        <w:t xml:space="preserve">Add a status badge to the README later:</w:t>
-      </w:r>
-    </w:p>
-    <w:p>
-      <w:pPr>
-        <w:pBdr>
-          <w:left w:val="single" w:color="9CA3AF" w:sz="12" w:space="8"/>
-        </w:pBdr>
-        <w:shd w:fill="F3F4F6" w:color="auto" w:val="clear"/>
-        <w:spacing w:after="160" w:before="120" w:line="260"/>
-        <w:ind w:left="200"/>
-      </w:pPr>
-      <w:r>
-        <w:rPr>
-          <w:rFonts w:ascii="Consolas" w:cs="Consolas" w:eastAsia="Consolas" w:hAnsi="Consolas"/>
-          <w:sz w:val="19"/>
-          <w:szCs w:val="19"/>
-        </w:rPr>
-        <w:t xml:space="preserve">![CI](https://github.com/mohsenmazaheri/BulkyWeb/actions/workflows/ci.yml/badge.svg)</w:t>
-      </w:r>
-    </w:p>
-    <w:p>
-      <w:pPr>
-        <w:pBdr>
-          <w:bottom w:val="single" w:color="BFBFBF" w:sz="6" w:space="1"/>
-        </w:pBdr>
-        <w:spacing w:after="200"/>
-      </w:pPr>
-    </w:p>
-    <w:p>
-      <w:pPr>
-        <w:pStyle w:val="Heading2"/>
-      </w:pPr>
-      <w:r>
-        <w:t xml:space="preserve">Key takeaways</w:t>
+        <w:t xml:space="preserve"> check only appears in the list after the workflow has run once. Required approvals is only shown after ticking "Require a pull request before merging" (sometimes under "Show additional settings"); its default is already 0.</w:t>
+      </w:r>
+    </w:p>
+    <w:p>
+      <w:pPr>
+        <w:pStyle w:val="Heading3"/>
+      </w:pPr>
+      <w:r>
+        <w:t xml:space="preserve">Verified</w:t>
       </w:r>
     </w:p>
     <w:p>
@@ -2523,7 +2974,34 @@
         </w:numPr>
       </w:pPr>
       <w:r>
-        <w:t xml:space="preserve">CI builds and tests every change automatically on a clean machine.</w:t>
+        <w:rPr>
+          <w:b/>
+          <w:bCs/>
+        </w:rPr>
+        <w:t xml:space="preserve">The workflow:</w:t>
+      </w:r>
+      <w:r>
+        <w:t xml:space="preserve"> both first runs passed, on the </w:t>
+      </w:r>
+      <w:r>
+        <w:rPr>
+          <w:rFonts w:ascii="Consolas" w:cs="Consolas" w:eastAsia="Consolas" w:hAnsi="Consolas"/>
+          <w:color w:val="C7254E"/>
+        </w:rPr>
+        <w:t xml:space="preserve">feature/ci</w:t>
+      </w:r>
+      <w:r>
+        <w:t xml:space="preserve"> pull request and on </w:t>
+      </w:r>
+      <w:r>
+        <w:rPr>
+          <w:rFonts w:ascii="Consolas" w:cs="Consolas" w:eastAsia="Consolas" w:hAnsi="Consolas"/>
+          <w:color w:val="C7254E"/>
+        </w:rPr>
+        <w:t xml:space="preserve">master</w:t>
+      </w:r>
+      <w:r>
+        <w:t xml:space="preserve"> after the merge.</w:t>
       </w:r>
     </w:p>
     <w:p>
@@ -2535,47 +3013,64 @@
         </w:numPr>
       </w:pPr>
       <w:r>
-        <w:t xml:space="preserve">A workflow is triggers (</w:t>
+        <w:rPr>
+          <w:b/>
+          <w:bCs/>
+        </w:rPr>
+        <w:t xml:space="preserve">The rules:</w:t>
+      </w:r>
+      <w:r>
+        <w:t xml:space="preserve"> the active rules were read from GitHub's public API (</w:t>
       </w:r>
       <w:r>
         <w:rPr>
           <w:rFonts w:ascii="Consolas" w:cs="Consolas" w:eastAsia="Consolas" w:hAnsi="Consolas"/>
           <w:color w:val="C7254E"/>
         </w:rPr>
-        <w:t xml:space="preserve">on</w:t>
-      </w:r>
-      <w:r>
-        <w:t xml:space="preserve">), jobs, a runner (</w:t>
+        <w:t xml:space="preserve">GET /repos/{owner}/{repo}/rules/branches/master</w:t>
+      </w:r>
+      <w:r>
+        <w:t xml:space="preserve">). All four are listed: </w:t>
       </w:r>
       <w:r>
         <w:rPr>
           <w:rFonts w:ascii="Consolas" w:cs="Consolas" w:eastAsia="Consolas" w:hAnsi="Consolas"/>
           <w:color w:val="C7254E"/>
         </w:rPr>
-        <w:t xml:space="preserve">runs-on</w:t>
-      </w:r>
-      <w:r>
-        <w:t xml:space="preserve">) and steps (</w:t>
+        <w:t xml:space="preserve">deletion</w:t>
+      </w:r>
+      <w:r>
+        <w:t xml:space="preserve">, </w:t>
       </w:r>
       <w:r>
         <w:rPr>
           <w:rFonts w:ascii="Consolas" w:cs="Consolas" w:eastAsia="Consolas" w:hAnsi="Consolas"/>
           <w:color w:val="C7254E"/>
         </w:rPr>
-        <w:t xml:space="preserve">uses</w:t>
-      </w:r>
-      <w:r>
-        <w:t xml:space="preserve"> / </w:t>
+        <w:t xml:space="preserve">non_fast_forward</w:t>
+      </w:r>
+      <w:r>
+        <w:t xml:space="preserve">, </w:t>
       </w:r>
       <w:r>
         <w:rPr>
           <w:rFonts w:ascii="Consolas" w:cs="Consolas" w:eastAsia="Consolas" w:hAnsi="Consolas"/>
           <w:color w:val="C7254E"/>
         </w:rPr>
-        <w:t xml:space="preserve">run</w:t>
-      </w:r>
-      <w:r>
-        <w:t xml:space="preserve">).</w:t>
+        <w:t xml:space="preserve">required_status_checks</w:t>
+      </w:r>
+      <w:r>
+        <w:t xml:space="preserve"> (build-and-test, strict) and </w:t>
+      </w:r>
+      <w:r>
+        <w:rPr>
+          <w:rFonts w:ascii="Consolas" w:cs="Consolas" w:eastAsia="Consolas" w:hAnsi="Consolas"/>
+          <w:color w:val="C7254E"/>
+        </w:rPr>
+        <w:t xml:space="preserve">pull_request</w:t>
+      </w:r>
+      <w:r>
+        <w:t xml:space="preserve"> (0 approvals).</w:t>
       </w:r>
     </w:p>
     <w:p>
@@ -2587,7 +3082,132 @@
         </w:numPr>
       </w:pPr>
       <w:r>
-        <w:t xml:space="preserve">Give workflows the least permissions they need.</w:t>
+        <w:rPr>
+          <w:b/>
+          <w:bCs/>
+        </w:rPr>
+        <w:t xml:space="preserve">A direct push</w:t>
+      </w:r>
+      <w:r>
+        <w:t xml:space="preserve"> of an empty test commit to </w:t>
+      </w:r>
+      <w:r>
+        <w:rPr>
+          <w:rFonts w:ascii="Consolas" w:cs="Consolas" w:eastAsia="Consolas" w:hAnsi="Consolas"/>
+          <w:color w:val="C7254E"/>
+        </w:rPr>
+        <w:t xml:space="preserve">master</w:t>
+      </w:r>
+      <w:r>
+        <w:t xml:space="preserve"> was rejected:</w:t>
+      </w:r>
+    </w:p>
+    <w:p>
+      <w:pPr>
+        <w:pBdr>
+          <w:left w:val="single" w:color="9CA3AF" w:sz="12" w:space="8"/>
+        </w:pBdr>
+        <w:shd w:fill="F3F4F6" w:color="auto" w:val="clear"/>
+        <w:spacing w:after="0" w:before="120" w:line="260"/>
+        <w:ind w:left="200"/>
+      </w:pPr>
+      <w:r>
+        <w:rPr>
+          <w:rFonts w:ascii="Consolas" w:cs="Consolas" w:eastAsia="Consolas" w:hAnsi="Consolas"/>
+          <w:sz w:val="19"/>
+          <w:szCs w:val="19"/>
+        </w:rPr>
+        <w:t xml:space="preserve">remote: error: GH013: Repository rule violations found for refs/heads/master.</w:t>
+      </w:r>
+    </w:p>
+    <w:p>
+      <w:pPr>
+        <w:pBdr>
+          <w:left w:val="single" w:color="9CA3AF" w:sz="12" w:space="8"/>
+        </w:pBdr>
+        <w:shd w:fill="F3F4F6" w:color="auto" w:val="clear"/>
+        <w:spacing w:after="0" w:before="0" w:line="260"/>
+        <w:ind w:left="200"/>
+      </w:pPr>
+      <w:r>
+        <w:rPr>
+          <w:rFonts w:ascii="Consolas" w:cs="Consolas" w:eastAsia="Consolas" w:hAnsi="Consolas"/>
+          <w:sz w:val="19"/>
+          <w:szCs w:val="19"/>
+        </w:rPr>
+        <w:t xml:space="preserve">remote: - Required status check "build-and-test" is expected.</w:t>
+      </w:r>
+    </w:p>
+    <w:p>
+      <w:pPr>
+        <w:pBdr>
+          <w:left w:val="single" w:color="9CA3AF" w:sz="12" w:space="8"/>
+        </w:pBdr>
+        <w:shd w:fill="F3F4F6" w:color="auto" w:val="clear"/>
+        <w:spacing w:after="160" w:before="0" w:line="260"/>
+        <w:ind w:left="200"/>
+      </w:pPr>
+      <w:r>
+        <w:rPr>
+          <w:rFonts w:ascii="Consolas" w:cs="Consolas" w:eastAsia="Consolas" w:hAnsi="Consolas"/>
+          <w:sz w:val="19"/>
+          <w:szCs w:val="19"/>
+        </w:rPr>
+        <w:t xml:space="preserve"> ! [remote rejected] master -&gt; master (push declined due to repository rule violations)</w:t>
+      </w:r>
+    </w:p>
+    <w:p>
+      <w:r>
+        <w:t xml:space="preserve">The local test commit was then removed with </w:t>
+      </w:r>
+      <w:r>
+        <w:rPr>
+          <w:rFonts w:ascii="Consolas" w:cs="Consolas" w:eastAsia="Consolas" w:hAnsi="Consolas"/>
+          <w:color w:val="C7254E"/>
+        </w:rPr>
+        <w:t xml:space="preserve">git reset --keep origin/master</w:t>
+      </w:r>
+      <w:r>
+        <w:t xml:space="preserve">.</w:t>
+      </w:r>
+    </w:p>
+    <w:p>
+      <w:r>
+        <w:t xml:space="preserve">Status badge for the README:</w:t>
+      </w:r>
+    </w:p>
+    <w:p>
+      <w:pPr>
+        <w:pBdr>
+          <w:left w:val="single" w:color="9CA3AF" w:sz="12" w:space="8"/>
+        </w:pBdr>
+        <w:shd w:fill="F3F4F6" w:color="auto" w:val="clear"/>
+        <w:spacing w:after="160" w:before="120" w:line="260"/>
+        <w:ind w:left="200"/>
+      </w:pPr>
+      <w:r>
+        <w:rPr>
+          <w:rFonts w:ascii="Consolas" w:cs="Consolas" w:eastAsia="Consolas" w:hAnsi="Consolas"/>
+          <w:sz w:val="19"/>
+          <w:szCs w:val="19"/>
+        </w:rPr>
+        <w:t xml:space="preserve">[![CI](https://github.com/mohsenmazaheri/BulkyWeb/actions/workflows/ci.yml/badge.svg)](https://github.com/mohsenmazaheri/BulkyWeb/actions/workflows/ci.yml)</w:t>
+      </w:r>
+    </w:p>
+    <w:p>
+      <w:pPr>
+        <w:pBdr>
+          <w:bottom w:val="single" w:color="BFBFBF" w:sz="6" w:space="1"/>
+        </w:pBdr>
+        <w:spacing w:after="200"/>
+      </w:pPr>
+    </w:p>
+    <w:p>
+      <w:pPr>
+        <w:pStyle w:val="Heading2"/>
+      </w:pPr>
+      <w:r>
+        <w:t xml:space="preserve">Key takeaways</w:t>
       </w:r>
     </w:p>
     <w:p>
@@ -2599,7 +3219,7 @@
         </w:numPr>
       </w:pPr>
       <w:r>
-        <w:t xml:space="preserve">Pin the SDK with global.json and check action versions.</w:t>
+        <w:t xml:space="preserve">CI builds and tests every change automatically on a clean machine.</w:t>
       </w:r>
     </w:p>
     <w:p>
@@ -2611,7 +3231,47 @@
         </w:numPr>
       </w:pPr>
       <w:r>
-        <w:t xml:space="preserve">Keep test results and coverage as artifacts. Read coverage critically.</w:t>
+        <w:t xml:space="preserve">A workflow is triggers (</w:t>
+      </w:r>
+      <w:r>
+        <w:rPr>
+          <w:rFonts w:ascii="Consolas" w:cs="Consolas" w:eastAsia="Consolas" w:hAnsi="Consolas"/>
+          <w:color w:val="C7254E"/>
+        </w:rPr>
+        <w:t xml:space="preserve">on</w:t>
+      </w:r>
+      <w:r>
+        <w:t xml:space="preserve">), jobs, a runner (</w:t>
+      </w:r>
+      <w:r>
+        <w:rPr>
+          <w:rFonts w:ascii="Consolas" w:cs="Consolas" w:eastAsia="Consolas" w:hAnsi="Consolas"/>
+          <w:color w:val="C7254E"/>
+        </w:rPr>
+        <w:t xml:space="preserve">runs-on</w:t>
+      </w:r>
+      <w:r>
+        <w:t xml:space="preserve">) and steps (</w:t>
+      </w:r>
+      <w:r>
+        <w:rPr>
+          <w:rFonts w:ascii="Consolas" w:cs="Consolas" w:eastAsia="Consolas" w:hAnsi="Consolas"/>
+          <w:color w:val="C7254E"/>
+        </w:rPr>
+        <w:t xml:space="preserve">uses</w:t>
+      </w:r>
+      <w:r>
+        <w:t xml:space="preserve"> / </w:t>
+      </w:r>
+      <w:r>
+        <w:rPr>
+          <w:rFonts w:ascii="Consolas" w:cs="Consolas" w:eastAsia="Consolas" w:hAnsi="Consolas"/>
+          <w:color w:val="C7254E"/>
+        </w:rPr>
+        <w:t xml:space="preserve">run</w:t>
+      </w:r>
+      <w:r>
+        <w:t xml:space="preserve">).</w:t>
       </w:r>
     </w:p>
     <w:p>
@@ -2623,7 +3283,7 @@
         </w:numPr>
       </w:pPr>
       <w:r>
-        <w:t xml:space="preserve">Run security checks in the pipeline, not only by hand.</w:t>
+        <w:t xml:space="preserve">Give workflows the least permissions they need.</w:t>
       </w:r>
     </w:p>
     <w:p>
@@ -2635,7 +3295,7 @@
         </w:numPr>
       </w:pPr>
       <w:r>
-        <w:t xml:space="preserve">CI on Linux catches case-sensitivity bugs that Windows hides.</w:t>
+        <w:t xml:space="preserve">Pin the SDK with global.json and check action versions.</w:t>
       </w:r>
     </w:p>
     <w:p>
@@ -2647,7 +3307,43 @@
         </w:numPr>
       </w:pPr>
       <w:r>
-        <w:t xml:space="preserve">Make the CI check required, so broken code cannot be merged.</w:t>
+        <w:t xml:space="preserve">Keep test results and coverage as artifacts. Read coverage critically.</w:t>
+      </w:r>
+    </w:p>
+    <w:p>
+      <w:pPr>
+        <w:pStyle w:val="ListParagraph"/>
+        <w:numPr>
+          <w:ilvl w:val="0"/>
+          <w:numId w:val="2"/>
+        </w:numPr>
+      </w:pPr>
+      <w:r>
+        <w:t xml:space="preserve">Run security checks in the pipeline, not only by hand.</w:t>
+      </w:r>
+    </w:p>
+    <w:p>
+      <w:pPr>
+        <w:pStyle w:val="ListParagraph"/>
+        <w:numPr>
+          <w:ilvl w:val="0"/>
+          <w:numId w:val="2"/>
+        </w:numPr>
+      </w:pPr>
+      <w:r>
+        <w:t xml:space="preserve">CI on Linux catches case-sensitivity bugs that Windows hides.</w:t>
+      </w:r>
+    </w:p>
+    <w:p>
+      <w:pPr>
+        <w:pStyle w:val="ListParagraph"/>
+        <w:numPr>
+          <w:ilvl w:val="0"/>
+          <w:numId w:val="2"/>
+        </w:numPr>
+      </w:pPr>
+      <w:r>
+        <w:t xml:space="preserve">Make the CI check required with a ruleset, so broken code cannot be merged. Verify it with the API and a test push.</w:t>
       </w:r>
     </w:p>
     <w:p>

</xml_diff>